<commit_message>
Publish aerospace research paper and web version
</commit_message>
<xml_diff>
--- a/RESEARCH_PAPER.docx
+++ b/RESEARCH_PAPER.docx
@@ -46,7 +46,7 @@
           <w:rFonts w:ascii="Times New Roman" w:hAnsi="Times New Roman"/>
           <w:sz w:val="22"/>
         </w:rPr>
-        <w:t xml:space="preserve"> [Your Institution]</w:t>
+        <w:t xml:space="preserve"> SRM Institute of Science and Technology</w:t>
       </w:r>
     </w:p>
     <w:p>
@@ -81,6 +81,30 @@
           <w:sz w:val="22"/>
         </w:rPr>
         <w:t xml:space="preserve"> September 2026</w:t>
+      </w:r>
+    </w:p>
+    <w:p>
+      <w:r>
+        <w:rPr>
+          <w:rFonts w:ascii="Times New Roman" w:hAnsi="Times New Roman"/>
+          <w:sz w:val="22"/>
+        </w:rPr>
+        <w:t xml:space="preserve">&gt; </w:t>
+      </w:r>
+      <w:r>
+        <w:rPr>
+          <w:rFonts w:ascii="Times New Roman" w:hAnsi="Times New Roman"/>
+          <w:b/>
+          <w:sz w:val="22"/>
+        </w:rPr>
+        <w:t>View online (no download):</w:t>
+      </w:r>
+      <w:r>
+        <w:rPr>
+          <w:rFonts w:ascii="Times New Roman" w:hAnsi="Times New Roman"/>
+          <w:sz w:val="22"/>
+        </w:rPr>
+        <w:t xml:space="preserve"> [Read on GitHub](https://github.com/quadratic1518/aerospace-team/blob/main/RESEARCH_PAPER.md) · [Web version](https://quadratic1518.github.io/aerospace-team/)</w:t>
       </w:r>
     </w:p>
     <w:p/>

</xml_diff>